<commit_message>
Add Section 10: Virtual Partners & Bench to playbook
Adds new section listing RGP's virtual partner bench:
- Michael Himmelfarb (HG Partners)
- Geoff Walker
- Brian Biondi
- Jack Daly (sales virtual partner)
- Clay Perfall
- Andy Putterman

Also includes "How the Bench Works" operating model.

Co-Authored-By: Claude Sonnet 4.6 <noreply@anthropic.com>
Claude-Session: https://claude.ai/code/session_013biLPuTMRZiNTuYUTktt6c
</commit_message>
<xml_diff>
--- a/RGP-Growth-Playbook.docx
+++ b/RGP-Growth-Playbook.docx
@@ -5190,6 +5190,320 @@
       <w:pgNumType/>
       <w:docGrid w:linePitch="360"/>
     </w:sectPr>
+    <w:p>
+      <w:pPr>
+        <w:pStyle w:val="Normal"/>
+        <w:pageBreakBefore/>
+        <w:spacing w:before="0" w:after="0"/>
+      </w:pPr>
+      <w:r>
+        <w:t/>
+      </w:r>
+    </w:p>
+    <w:p>
+      <w:pPr>
+        <w:spacing w:before="400" w:after="80"/>
+      </w:pPr>
+      <w:r>
+        <w:rPr>
+          <w:color w:val="176F73"/>
+          <w:sz w:val="16"/>
+          <w:szCs w:val="16"/>
+          <w:caps/>
+        </w:rPr>
+        <w:t xml:space="preserve">Section 10</w:t>
+      </w:r>
+    </w:p>
+    <w:p>
+      <w:pPr>
+        <w:pStyle w:val="Heading2"/>
+        <w:spacing w:before="360" w:after="80"/>
+      </w:pPr>
+      <w:r>
+        <w:rPr>
+          <w:color w:val="24313A"/>
+          <w:sz w:val="28"/>
+          <w:szCs w:val="28"/>
+        </w:rPr>
+        <w:t>Virtual Partners &amp; Bench</w:t>
+      </w:r>
+    </w:p>
+    <w:p>
+      <w:pPr>
+        <w:pBdr>
+          <w:bottom w:val="single" w:sz="6" w:space="1" w:color="DCE3E6"/>
+        </w:pBdr>
+        <w:spacing w:before="0" w:after="160"/>
+      </w:pPr>
+      <w:r>
+        <w:t/>
+      </w:r>
+    </w:p>
+    <w:p>
+      <w:pPr>
+        <w:spacing w:before="80" w:after="120"/>
+      </w:pPr>
+      <w:r>
+        <w:rPr>
+          <w:color w:val="5B6B75"/>
+          <w:sz w:val="20"/>
+          <w:szCs w:val="20"/>
+        </w:rPr>
+        <w:t>RGP assembles specialists around each mandate rather than carrying them as overhead. The following individuals represent the current bench of virtual partners and potential collaborators across the three pillars.</w:t>
+      </w:r>
+    </w:p>
+    <w:p>
+      <w:pPr>
+        <w:spacing w:before="280" w:after="60"/>
+      </w:pPr>
+      <w:r>
+        <w:rPr>
+          <w:color w:val="176F73"/>
+          <w:b/>
+          <w:sz w:val="22"/>
+          <w:szCs w:val="22"/>
+        </w:rPr>
+        <w:t>Current Bench</w:t>
+      </w:r>
+    </w:p>
+    <w:p>
+      <w:pPr>
+        <w:numPr>
+          <w:ilvl w:val="0"/>
+          <w:numId w:val="1"/>
+        </w:numPr>
+        <w:spacing w:before="60" w:after="60"/>
+      </w:pPr>
+      <w:r>
+        <w:rPr>
+          <w:color w:val="24313A"/>
+          <w:b/>
+          <w:sz w:val="20"/>
+          <w:szCs w:val="20"/>
+        </w:rPr>
+        <w:t xml:space="preserve">Michael Himmelfarb </w:t>
+      </w:r>
+      <w:r>
+        <w:rPr>
+          <w:color w:val="5B6B75"/>
+          <w:sz w:val="20"/>
+          <w:szCs w:val="20"/>
+        </w:rPr>
+        <w:t>(HG Partners) — Business development and partnership network.</w:t>
+      </w:r>
+    </w:p>
+    <w:p>
+      <w:pPr>
+        <w:numPr>
+          <w:ilvl w:val="0"/>
+          <w:numId w:val="1"/>
+        </w:numPr>
+        <w:spacing w:before="60" w:after="60"/>
+      </w:pPr>
+      <w:r>
+        <w:rPr>
+          <w:color w:val="24313A"/>
+          <w:b/>
+          <w:sz w:val="20"/>
+          <w:szCs w:val="20"/>
+        </w:rPr>
+        <w:t xml:space="preserve">Geoff Walker </w:t>
+      </w:r>
+      <w:r>
+        <w:rPr>
+          <w:color w:val="5B6B75"/>
+          <w:sz w:val="20"/>
+          <w:szCs w:val="20"/>
+        </w:rPr>
+        <w:t>— Discussed at 4 PM call; role TBD.</w:t>
+      </w:r>
+    </w:p>
+    <w:p>
+      <w:pPr>
+        <w:numPr>
+          <w:ilvl w:val="0"/>
+          <w:numId w:val="1"/>
+        </w:numPr>
+        <w:spacing w:before="60" w:after="60"/>
+      </w:pPr>
+      <w:r>
+        <w:rPr>
+          <w:color w:val="24313A"/>
+          <w:b/>
+          <w:sz w:val="20"/>
+          <w:szCs w:val="20"/>
+        </w:rPr>
+        <w:t xml:space="preserve">Brian Biondi </w:t>
+      </w:r>
+      <w:r>
+        <w:rPr>
+          <w:color w:val="5B6B75"/>
+          <w:sz w:val="20"/>
+          <w:szCs w:val="20"/>
+        </w:rPr>
+        <w:t>— Reached out re: family office; potential finance/investor access.</w:t>
+      </w:r>
+    </w:p>
+    <w:p>
+      <w:pPr>
+        <w:numPr>
+          <w:ilvl w:val="0"/>
+          <w:numId w:val="1"/>
+        </w:numPr>
+        <w:spacing w:before="60" w:after="60"/>
+      </w:pPr>
+      <w:r>
+        <w:rPr>
+          <w:color w:val="24313A"/>
+          <w:b/>
+          <w:sz w:val="20"/>
+          <w:szCs w:val="20"/>
+        </w:rPr>
+        <w:t xml:space="preserve">Jack Daly </w:t>
+      </w:r>
+      <w:r>
+        <w:rPr>
+          <w:color w:val="5B6B75"/>
+          <w:sz w:val="20"/>
+          <w:szCs w:val="20"/>
+        </w:rPr>
+        <w:t>— Sales virtual partner. Confirmed on the bench.</w:t>
+      </w:r>
+    </w:p>
+    <w:p>
+      <w:pPr>
+        <w:numPr>
+          <w:ilvl w:val="0"/>
+          <w:numId w:val="1"/>
+        </w:numPr>
+        <w:spacing w:before="60" w:after="60"/>
+      </w:pPr>
+      <w:r>
+        <w:rPr>
+          <w:color w:val="24313A"/>
+          <w:b/>
+          <w:sz w:val="20"/>
+          <w:szCs w:val="20"/>
+        </w:rPr>
+        <w:t xml:space="preserve">Clay Perfall </w:t>
+      </w:r>
+      <w:r>
+        <w:rPr>
+          <w:color w:val="5B6B75"/>
+          <w:sz w:val="20"/>
+          <w:szCs w:val="20"/>
+        </w:rPr>
+        <w:t>— Role TBD; flagged as potential partner.</w:t>
+      </w:r>
+    </w:p>
+    <w:p>
+      <w:pPr>
+        <w:numPr>
+          <w:ilvl w:val="0"/>
+          <w:numId w:val="1"/>
+        </w:numPr>
+        <w:spacing w:before="60" w:after="60"/>
+      </w:pPr>
+      <w:r>
+        <w:rPr>
+          <w:color w:val="24313A"/>
+          <w:b/>
+          <w:sz w:val="20"/>
+          <w:szCs w:val="20"/>
+        </w:rPr>
+        <w:t xml:space="preserve">Andy Putterman </w:t>
+      </w:r>
+      <w:r>
+        <w:rPr>
+          <w:color w:val="5B6B75"/>
+          <w:sz w:val="20"/>
+          <w:szCs w:val="20"/>
+        </w:rPr>
+        <w:t>— Role TBD; flagged as potential partner.</w:t>
+      </w:r>
+    </w:p>
+    <w:p>
+      <w:pPr>
+        <w:spacing w:before="280" w:after="60"/>
+      </w:pPr>
+      <w:r>
+        <w:rPr>
+          <w:color w:val="176F73"/>
+          <w:b/>
+          <w:sz w:val="22"/>
+          <w:szCs w:val="22"/>
+        </w:rPr>
+        <w:t>How the Bench Works</w:t>
+      </w:r>
+    </w:p>
+    <w:p>
+      <w:pPr>
+        <w:numPr>
+          <w:ilvl w:val="0"/>
+          <w:numId w:val="1"/>
+        </w:numPr>
+        <w:spacing w:before="60" w:after="60"/>
+      </w:pPr>
+      <w:r>
+        <w:rPr>
+          <w:color w:val="5B6B75"/>
+          <w:sz w:val="20"/>
+          <w:szCs w:val="20"/>
+        </w:rPr>
+        <w:t>Each specialist is brought in only when the mandate calls for their specific expertise.</w:t>
+      </w:r>
+    </w:p>
+    <w:p>
+      <w:pPr>
+        <w:numPr>
+          <w:ilvl w:val="0"/>
+          <w:numId w:val="1"/>
+        </w:numPr>
+        <w:spacing w:before="60" w:after="60"/>
+      </w:pPr>
+      <w:r>
+        <w:rPr>
+          <w:color w:val="5B6B75"/>
+          <w:sz w:val="20"/>
+          <w:szCs w:val="20"/>
+        </w:rPr>
+        <w:t>No one is carried as overhead between engagements.</w:t>
+      </w:r>
+    </w:p>
+    <w:p>
+      <w:pPr>
+        <w:numPr>
+          <w:ilvl w:val="0"/>
+          <w:numId w:val="1"/>
+        </w:numPr>
+        <w:spacing w:before="60" w:after="60"/>
+      </w:pPr>
+      <w:r>
+        <w:rPr>
+          <w:color w:val="5B6B75"/>
+          <w:sz w:val="20"/>
+          <w:szCs w:val="20"/>
+        </w:rPr>
+        <w:t>Devin remains the single accountable leader and point of contact for every client.</w:t>
+      </w:r>
+    </w:p>
+    <w:p>
+      <w:pPr>
+        <w:numPr>
+          <w:ilvl w:val="0"/>
+          <w:numId w:val="1"/>
+        </w:numPr>
+        <w:spacing w:before="60" w:after="60"/>
+      </w:pPr>
+      <w:r>
+        <w:rPr>
+          <w:color w:val="5B6B75"/>
+          <w:sz w:val="20"/>
+          <w:szCs w:val="20"/>
+        </w:rPr>
+        <w:t>This list is live — update as conversations progress and roles are confirmed.</w:t>
+      </w:r>
+    </w:p>
   </w:body>
 </w:document>
 </file>

</xml_diff>